<commit_message>
feat: remove the AFP field from the agreement certificate
</commit_message>
<xml_diff>
--- a/resources/templates/certificado_convenio_dirigido_afp_template.docx
+++ b/resources/templates/certificado_convenio_dirigido_afp_template.docx
@@ -29,7 +29,7 @@
           <w:noProof/>
           <w:lang w:val="es-419" w:eastAsia="es-419"/>
         </w:rPr>
-        <w:pict w14:anchorId="013C4B78">
+        <w:pict w14:anchorId="17CF4BFC">
           <v:shapetype id="_x0000_t201" coordsize="21600,21600" o:spt="201" path="m,l,21600r21600,l21600,xe">
             <v:stroke joinstyle="miter"/>
             <v:path shadowok="f" o:extrusionok="f" strokeok="f" fillok="f" o:connecttype="rect"/>
@@ -107,194 +107,23 @@
           <w:i/>
           <w:iCs/>
         </w:rPr>
-        <w:t>${AFP}</w:t>
-      </w:r>
+        <w:t>Administradora de Fondos de Pensiones</w:t>
+      </w:r>
+    </w:p>
+    <w:bookmarkEnd w:id="0"/>
+    <w:p>
+      <w:pPr>
+        <w:spacing w:after="0" w:line="240" w:lineRule="auto"/>
+        <w:rPr>
+          <w:rFonts w:asciiTheme="minorHAnsi" w:hAnsiTheme="minorHAnsi" w:cstheme="minorHAnsi"/>
+          <w:b/>
+          <w:bCs/>
+        </w:rPr>
+      </w:pPr>
     </w:p>
     <w:p>
       <w:pPr>
         <w:spacing w:after="0" w:line="240" w:lineRule="auto"/>
-        <w:jc w:val="both"/>
-        <w:rPr>
-          <w:rFonts w:asciiTheme="minorHAnsi" w:hAnsiTheme="minorHAnsi"/>
-          <w:i/>
-          <w:iCs/>
-        </w:rPr>
-      </w:pPr>
-      <w:r>
-        <w:rPr>
-          <w:rFonts w:asciiTheme="minorHAnsi" w:hAnsiTheme="minorHAnsi"/>
-          <w:i/>
-          <w:iCs/>
-        </w:rPr>
-        <w:t>AFP</w:t>
-      </w:r>
-      <w:r>
-        <w:rPr>
-          <w:rFonts w:asciiTheme="minorHAnsi" w:hAnsiTheme="minorHAnsi"/>
-          <w:i/>
-          <w:iCs/>
-        </w:rPr>
-        <w:fldChar w:fldCharType="begin"/>
-      </w:r>
-      <w:r>
-        <w:rPr>
-          <w:rFonts w:asciiTheme="minorHAnsi" w:hAnsiTheme="minorHAnsi"/>
-          <w:i/>
-          <w:iCs/>
-        </w:rPr>
-        <w:instrText xml:space="preserve"> IF </w:instrText>
-      </w:r>
-      <w:r>
-        <w:rPr>
-          <w:rFonts w:asciiTheme="minorHAnsi" w:hAnsiTheme="minorHAnsi"/>
-          <w:i/>
-          <w:iCs/>
-        </w:rPr>
-        <w:fldChar w:fldCharType="begin"/>
-      </w:r>
-      <w:r>
-        <w:rPr>
-          <w:rFonts w:asciiTheme="minorHAnsi" w:hAnsiTheme="minorHAnsi"/>
-          <w:i/>
-          <w:iCs/>
-        </w:rPr>
-        <w:instrText xml:space="preserve"> MERGEFIELD DESTINATARIO </w:instrText>
-      </w:r>
-      <w:r>
-        <w:rPr>
-          <w:rFonts w:asciiTheme="minorHAnsi" w:hAnsiTheme="minorHAnsi"/>
-          <w:i/>
-          <w:iCs/>
-        </w:rPr>
-        <w:fldChar w:fldCharType="end"/>
-      </w:r>
-      <w:r>
-        <w:rPr>
-          <w:rFonts w:asciiTheme="minorHAnsi" w:hAnsiTheme="minorHAnsi"/>
-          <w:i/>
-          <w:iCs/>
-        </w:rPr>
-        <w:instrText xml:space="preserve"> &lt;&gt; "" "Señores</w:instrText>
-      </w:r>
-    </w:p>
-    <w:p>
-      <w:pPr>
-        <w:spacing w:after="0" w:line="240" w:lineRule="auto"/>
-        <w:ind w:firstLine="708"/>
-        <w:jc w:val="both"/>
-        <w:rPr>
-          <w:rFonts w:asciiTheme="minorHAnsi" w:hAnsiTheme="minorHAnsi"/>
-          <w:b/>
-          <w:bCs/>
-          <w:i/>
-          <w:iCs/>
-          <w:noProof/>
-        </w:rPr>
-      </w:pPr>
-      <w:r>
-        <w:rPr>
-          <w:rFonts w:asciiTheme="minorHAnsi" w:hAnsiTheme="minorHAnsi"/>
-          <w:b/>
-          <w:bCs/>
-          <w:i/>
-          <w:iCs/>
-        </w:rPr>
-        <w:fldChar w:fldCharType="begin"/>
-      </w:r>
-      <w:r>
-        <w:rPr>
-          <w:rFonts w:asciiTheme="minorHAnsi" w:hAnsiTheme="minorHAnsi"/>
-          <w:b/>
-          <w:bCs/>
-          <w:i/>
-          <w:iCs/>
-        </w:rPr>
-        <w:instrText xml:space="preserve"> MERGEFIELD  DESTINATARIO \* Upper </w:instrText>
-      </w:r>
-      <w:r>
-        <w:rPr>
-          <w:rFonts w:asciiTheme="minorHAnsi" w:hAnsiTheme="minorHAnsi"/>
-          <w:b/>
-          <w:bCs/>
-          <w:i/>
-          <w:iCs/>
-        </w:rPr>
-        <w:fldChar w:fldCharType="separate"/>
-      </w:r>
-      <w:r>
-        <w:rPr>
-          <w:rFonts w:asciiTheme="minorHAnsi" w:hAnsiTheme="minorHAnsi"/>
-          <w:b/>
-          <w:bCs/>
-          <w:i/>
-          <w:iCs/>
-          <w:noProof/>
-        </w:rPr>
-        <w:instrText>COOPERATIVA FINANCIERA</w:instrText>
-      </w:r>
-    </w:p>
-    <w:p>
-      <w:pPr>
-        <w:spacing w:after="0" w:line="240" w:lineRule="auto"/>
-        <w:ind w:firstLine="708"/>
-        <w:rPr>
-          <w:rFonts w:asciiTheme="minorHAnsi" w:hAnsiTheme="minorHAnsi" w:cstheme="minorHAnsi"/>
-          <w:b/>
-          <w:bCs/>
-        </w:rPr>
-      </w:pPr>
-      <w:r>
-        <w:rPr>
-          <w:rFonts w:asciiTheme="minorHAnsi" w:hAnsiTheme="minorHAnsi"/>
-          <w:b/>
-          <w:bCs/>
-          <w:i/>
-          <w:iCs/>
-          <w:noProof/>
-        </w:rPr>
-        <w:instrText>MEDELLIN</w:instrText>
-      </w:r>
-      <w:r>
-        <w:rPr>
-          <w:rFonts w:asciiTheme="minorHAnsi" w:hAnsiTheme="minorHAnsi"/>
-          <w:b/>
-          <w:bCs/>
-          <w:i/>
-          <w:iCs/>
-        </w:rPr>
-        <w:fldChar w:fldCharType="end"/>
-      </w:r>
-      <w:r>
-        <w:rPr>
-          <w:rFonts w:asciiTheme="minorHAnsi" w:hAnsiTheme="minorHAnsi"/>
-          <w:b/>
-          <w:bCs/>
-          <w:i/>
-          <w:iCs/>
-        </w:rPr>
-        <w:instrText xml:space="preserve"> </w:instrText>
-      </w:r>
-      <w:r>
-        <w:rPr>
-          <w:rFonts w:asciiTheme="minorHAnsi" w:hAnsiTheme="minorHAnsi"/>
-          <w:i/>
-          <w:iCs/>
-        </w:rPr>
-        <w:instrText xml:space="preserve">" "" </w:instrText>
-      </w:r>
-      <w:r>
-        <w:rPr>
-          <w:rFonts w:asciiTheme="minorHAnsi" w:hAnsiTheme="minorHAnsi"/>
-          <w:i/>
-          <w:iCs/>
-        </w:rPr>
-        <w:fldChar w:fldCharType="end"/>
-      </w:r>
-      <w:bookmarkEnd w:id="0"/>
-    </w:p>
-    <w:p>
-      <w:pPr>
-        <w:spacing w:after="0" w:line="240" w:lineRule="auto"/>
         <w:rPr>
           <w:rFonts w:asciiTheme="minorHAnsi" w:hAnsiTheme="minorHAnsi"/>
           <w:b/>
@@ -341,7 +170,7 @@
           <w:iCs/>
           <w:u w:val="single"/>
         </w:rPr>
-        <w:t>Corrección de Historia en AFP</w:t>
+        <w:t xml:space="preserve">Corrección de Historia en </w:t>
       </w:r>
       <w:r>
         <w:rPr>
@@ -351,18 +180,7 @@
           <w:iCs/>
           <w:u w:val="single"/>
         </w:rPr>
-        <w:t xml:space="preserve"> </w:t>
-      </w:r>
-      <w:r>
-        <w:rPr>
-          <w:rFonts w:asciiTheme="minorHAnsi" w:hAnsiTheme="minorHAnsi"/>
-          <w:b/>
-          <w:bCs/>
-          <w:i/>
-          <w:iCs/>
-          <w:u w:val="single"/>
-        </w:rPr>
-        <w:t>${AFP}</w:t>
+        <w:t>Administradora de Fondos de Pensiones</w:t>
       </w:r>
     </w:p>
     <w:p>
@@ -9579,7 +9397,7 @@
           <w:iCs/>
           <w:u w:val="single"/>
         </w:rPr>
-        <w:t>Corrección de Historia en AFP</w:t>
+        <w:t xml:space="preserve">Corrección de Historia en </w:t>
       </w:r>
       <w:r>
         <w:rPr>
@@ -9590,18 +9408,18 @@
           <w:iCs/>
           <w:u w:val="single"/>
         </w:rPr>
-        <w:t xml:space="preserve"> </w:t>
-      </w:r>
-      <w:r>
-        <w:rPr>
-          <w:rFonts w:asciiTheme="minorHAnsi" w:hAnsiTheme="minorHAnsi"/>
+        <w:t xml:space="preserve">la </w:t>
+      </w:r>
+      <w:r>
+        <w:rPr>
+          <w:rFonts w:asciiTheme="minorHAnsi" w:hAnsiTheme="minorHAnsi" w:cstheme="minorHAnsi"/>
           <w:b/>
           <w:bCs/>
           <w:i/>
           <w:iCs/>
           <w:u w:val="single"/>
         </w:rPr>
-        <w:t>${AFP}</w:t>
+        <w:t>Administradora de Fondos de Pensiones</w:t>
       </w:r>
       <w:r>
         <w:rPr>
@@ -9811,21 +9629,7 @@
     </w:p>
     <w:p>
       <w:pPr>
-        <w:pStyle w:val="Sinespaciado"/>
-        <w:ind w:left="709"/>
-        <w:jc w:val="both"/>
-        <w:rPr>
-          <w:b/>
-          <w:i/>
-          <w:iCs/>
-        </w:rPr>
-      </w:pPr>
-    </w:p>
-    <w:p>
-      <w:pPr>
         <w:spacing w:after="0" w:line="240" w:lineRule="auto"/>
-        <w:ind w:left="708"/>
-        <w:jc w:val="right"/>
         <w:rPr>
           <w:rFonts w:asciiTheme="minorHAnsi" w:hAnsiTheme="minorHAnsi"/>
           <w:b/>
@@ -10438,7 +10242,7 @@
         <v:path o:extrusionok="f" gradientshapeok="t" o:connecttype="rect"/>
         <o:lock v:ext="edit" aspectratio="t"/>
       </v:shapetype>
-      <v:shape id="Imagen 1302488667" o:spid="_x0000_i1025" type="#_x0000_t75" style="width:11pt;height:11pt;visibility:visible;mso-wrap-style:square" o:bullet="t">
+      <v:shape id="Imagen 1302488667" o:spid="_x0000_i1025" type="#_x0000_t75" style="width:10.9pt;height:10.9pt;visibility:visible;mso-wrap-style:square" o:bullet="t">
         <v:imagedata r:id="rId1" o:title=""/>
       </v:shape>
     </w:pict>

</xml_diff>